<commit_message>
Los .docx recogen las enmiendas; fuera la lista de excepciones
Las 29 modificaciones del 28/09 ya están en los documentos fuente, editados
sobre su XML clonando los párrafos existentes para conservar formato. La
lista temporal que las cubría se borra y la comprobación de fidelidad vuelve
a ser total. Avisó el propio test de obsolescencia, fallando en las 29 a la
vez.

De paso aparece una discrepancia que conviene conocer: los documentos no
numeran las rejillas Likert, así que desde el bloque 5 su secuencia va una
por detrás de los ids del código — «amenazas 2040» es la 15 en el documento y
C-Q16 en el código. Las preguntas nuevas se numeran según el documento, que
es lo que lee quien lo abre.

Co-Authored-By: Claude Opus 5 (1M context) <noreply@anthropic.com>
</commit_message>
<xml_diff>
--- a/2_Encuesta_Usuario_Final_DO_Jamon_Teruel.docx
+++ b/2_Encuesta_Usuario_Final_DO_Jamon_Teruel.docx
@@ -723,6 +723,29 @@
       </w:pPr>
       <w:r>
         <w:rPr>
+          <w:rFonts w:ascii="Calibri" w:cs="Calibri" w:eastAsia="Calibri" w:hAnsi="Calibri"/>
+          <w:color w:val="7A1E2B"/>
+          <w:sz w:val="22"/>
+          <w:szCs w:val="22"/>
+        </w:rPr>
+        <w:t xml:space="preserve">◻  </w:t>
+      </w:r>
+      <w:r>
+        <w:rPr>
+          <w:rFonts w:ascii="Calibri" w:cs="Calibri" w:eastAsia="Calibri" w:hAnsi="Calibri"/>
+          <w:sz w:val="21"/>
+          <w:szCs w:val="21"/>
+        </w:rPr>
+        <w:t xml:space="preserve">Como merienda o almuerzo, no a diario</w:t>
+      </w:r>
+    </w:p>
+    <w:p>
+      <w:pPr>
+        <w:spacing w:after="24"/>
+        <w:ind w:left="460"/>
+      </w:pPr>
+      <w:r>
+        <w:rPr>
           <w:color w:val="7A1E2B"/>
         </w:rPr>
         <w:t xml:space="preserve">◻  </w:t>
@@ -752,6 +775,80 @@
           <w:szCs w:val="21"/>
         </w:rPr>
         <w:t>Como regalo</w:t>
+      </w:r>
+    </w:p>
+    <w:p>
+      <w:pPr>
+        <w:spacing w:after="24"/>
+        <w:ind w:left="460"/>
+      </w:pPr>
+      <w:r>
+        <w:rPr>
+          <w:rFonts w:ascii="Calibri" w:cs="Calibri" w:eastAsia="Calibri" w:hAnsi="Calibri"/>
+          <w:color w:val="7A1E2B"/>
+          <w:sz w:val="22"/>
+          <w:szCs w:val="22"/>
+        </w:rPr>
+        <w:t xml:space="preserve">◻  </w:t>
+      </w:r>
+      <w:r>
+        <w:rPr>
+          <w:rFonts w:ascii="Calibri" w:cs="Calibri" w:eastAsia="Calibri" w:hAnsi="Calibri"/>
+          <w:sz w:val="21"/>
+          <w:szCs w:val="21"/>
+        </w:rPr>
+        <w:t xml:space="preserve">Otras</w:t>
+      </w:r>
+    </w:p>
+    <w:p>
+      <w:pPr>
+        <w:spacing w:after="60" w:before="120"/>
+        <w:ind w:left="360" w:hanging="360"/>
+      </w:pPr>
+      <w:r>
+        <w:rPr>
+          <w:rFonts w:ascii="Calibri" w:cs="Calibri" w:eastAsia="Calibri" w:hAnsi="Calibri"/>
+          <w:b/>
+          <w:bCs/>
+          <w:color w:val="7A1E2B"/>
+          <w:sz w:val="22"/>
+          <w:szCs w:val="22"/>
+        </w:rPr>
+        <w:t xml:space="preserve">7b. </w:t>
+      </w:r>
+      <w:r>
+        <w:rPr>
+          <w:rFonts w:ascii="Calibri" w:cs="Calibri" w:eastAsia="Calibri" w:hAnsi="Calibri"/>
+          <w:sz w:val="22"/>
+          <w:szCs w:val="22"/>
+        </w:rPr>
+        <w:t xml:space="preserve">¿En qué otras ocasiones?</w:t>
+      </w:r>
+      <w:r>
+        <w:rPr>
+          <w:rFonts w:ascii="Calibri" w:cs="Calibri" w:eastAsia="Calibri" w:hAnsi="Calibri"/>
+          <w:i/>
+          <w:iCs/>
+          <w:color w:val="6A6F76"/>
+          <w:sz w:val="19"/>
+          <w:szCs w:val="19"/>
+        </w:rPr>
+        <w:t xml:space="preserve">  (opcional)</w:t>
+      </w:r>
+    </w:p>
+    <w:p>
+      <w:pPr>
+        <w:spacing w:after="80"/>
+        <w:ind w:left="460"/>
+      </w:pPr>
+      <w:r>
+        <w:rPr>
+          <w:rFonts w:ascii="Calibri" w:cs="Calibri" w:eastAsia="Calibri" w:hAnsi="Calibri"/>
+          <w:color w:val="9AA0A6"/>
+          <w:sz w:val="21"/>
+          <w:szCs w:val="21"/>
+        </w:rPr>
+        <w:t xml:space="preserve">⸻⸻⸻⸻⸻⸻⸻⸻⸻⸻</w:t>
       </w:r>
     </w:p>
     <w:p>
@@ -1133,7 +1230,7 @@
           <w:sz w:val="21"/>
           <w:szCs w:val="21"/>
         </w:rPr>
-        <w:t>Salud (sal, aditivos)</w:t>
+        <w:t>Composición</w:t>
       </w:r>
       <w:r>
         <w:rPr>
@@ -1205,6 +1302,46 @@
           <w:szCs w:val="21"/>
         </w:rPr>
         <w:t xml:space="preserve">     1  2  3  4  5</w:t>
+      </w:r>
+    </w:p>
+    <w:p>
+      <w:pPr>
+        <w:spacing w:after="60" w:before="120"/>
+        <w:ind w:left="360" w:hanging="360"/>
+      </w:pPr>
+      <w:r>
+        <w:rPr>
+          <w:rFonts w:ascii="Calibri" w:cs="Calibri" w:eastAsia="Calibri" w:hAnsi="Calibri"/>
+          <w:sz w:val="22"/>
+          <w:szCs w:val="22"/>
+        </w:rPr>
+        <w:t xml:space="preserve">¿Hay algún otro factor importante para usted?</w:t>
+      </w:r>
+      <w:r>
+        <w:rPr>
+          <w:rFonts w:ascii="Calibri" w:cs="Calibri" w:eastAsia="Calibri" w:hAnsi="Calibri"/>
+          <w:i/>
+          <w:iCs/>
+          <w:color w:val="6A6F76"/>
+          <w:sz w:val="19"/>
+          <w:szCs w:val="19"/>
+        </w:rPr>
+        <w:t xml:space="preserve">  (opcional)</w:t>
+      </w:r>
+    </w:p>
+    <w:p>
+      <w:pPr>
+        <w:spacing w:after="80"/>
+        <w:ind w:left="460"/>
+      </w:pPr>
+      <w:r>
+        <w:rPr>
+          <w:rFonts w:ascii="Calibri" w:cs="Calibri" w:eastAsia="Calibri" w:hAnsi="Calibri"/>
+          <w:color w:val="9AA0A6"/>
+          <w:sz w:val="21"/>
+          <w:szCs w:val="21"/>
+        </w:rPr>
+        <w:t xml:space="preserve">⸻⸻⸻⸻⸻⸻⸻⸻⸻⸻</w:t>
       </w:r>
     </w:p>
     <w:p>
@@ -1270,7 +1407,7 @@
         <w:t xml:space="preserve">9. </w:t>
       </w:r>
       <w:r>
-        <w:t>¿A qué precio le parecería tan barato que dudaría de su calidad?</w:t>
+        <w:t>¿Qué precio le parecería tan barato que dudaría de su calidad?</w:t>
       </w:r>
       <w:r>
         <w:rPr>
@@ -1297,7 +1434,7 @@
         <w:t xml:space="preserve">10. </w:t>
       </w:r>
       <w:r>
-        <w:t>¿A qué precio le parecería barato / buena oportunidad?</w:t>
+        <w:t>¿Qué precio le parecería una buena oportunidad?</w:t>
       </w:r>
       <w:r>
         <w:rPr>
@@ -1324,7 +1461,7 @@
         <w:t xml:space="preserve">11. </w:t>
       </w:r>
       <w:r>
-        <w:t>¿A qué precio empezaría a parecerle caro?</w:t>
+        <w:t>¿Qué precio empezaría a parecerle caro?</w:t>
       </w:r>
       <w:r>
         <w:rPr>
@@ -1339,6 +1476,57 @@
     </w:p>
     <w:p>
       <w:pPr>
+        <w:spacing w:after="60" w:before="120"/>
+        <w:ind w:left="360" w:hanging="360"/>
+      </w:pPr>
+      <w:r>
+        <w:rPr>
+          <w:rFonts w:ascii="Calibri" w:cs="Calibri" w:eastAsia="Calibri" w:hAnsi="Calibri"/>
+          <w:b/>
+          <w:bCs/>
+          <w:color w:val="7A1E2B"/>
+          <w:sz w:val="22"/>
+          <w:szCs w:val="22"/>
+        </w:rPr>
+        <w:t xml:space="preserve">11b. </w:t>
+      </w:r>
+      <w:r>
+        <w:rPr>
+          <w:rFonts w:ascii="Calibri" w:cs="Calibri" w:eastAsia="Calibri" w:hAnsi="Calibri"/>
+          <w:sz w:val="22"/>
+          <w:szCs w:val="22"/>
+        </w:rPr>
+        <w:t xml:space="preserve">¿Quiere matizar algo sobre el precio?</w:t>
+      </w:r>
+      <w:r>
+        <w:rPr>
+          <w:rFonts w:ascii="Calibri" w:cs="Calibri" w:eastAsia="Calibri" w:hAnsi="Calibri"/>
+          <w:i/>
+          <w:iCs/>
+          <w:color w:val="6A6F76"/>
+          <w:sz w:val="19"/>
+          <w:szCs w:val="19"/>
+        </w:rPr>
+        <w:t xml:space="preserve">  (opcional)</w:t>
+      </w:r>
+    </w:p>
+    <w:p>
+      <w:pPr>
+        <w:spacing w:after="80"/>
+        <w:ind w:left="460"/>
+      </w:pPr>
+      <w:r>
+        <w:rPr>
+          <w:rFonts w:ascii="Calibri" w:cs="Calibri" w:eastAsia="Calibri" w:hAnsi="Calibri"/>
+          <w:color w:val="9AA0A6"/>
+          <w:sz w:val="21"/>
+          <w:szCs w:val="21"/>
+        </w:rPr>
+        <w:t xml:space="preserve">⸻⸻⸻⸻⸻⸻⸻⸻⸻⸻</w:t>
+      </w:r>
+    </w:p>
+    <w:p>
+      <w:pPr>
         <w:spacing w:before="120" w:after="20"/>
         <w:ind w:left="360" w:hanging="360"/>
       </w:pPr>
@@ -1351,7 +1539,7 @@
         <w:t xml:space="preserve">12. </w:t>
       </w:r>
       <w:r>
-        <w:t>¿A qué precio le parecería tan caro que no lo compraría?</w:t>
+        <w:t>¿Qué precio le parecería tan caro que no lo compraría?</w:t>
       </w:r>
       <w:r>
         <w:rPr>

</xml_diff>